<commit_message>
docs: atualizar proposta e documentação para a premissa de mobilidade urbana
Proposta (2 páginas) e documentação técnica, de negócio e de produto
(13 páginas) reescritas sem o recorte de saúde: cidade alcançável em
30 minutos, escala de chuva até 45 mm em 24 h, frequência anual das
chuvas que já causam bloqueios, curva de mobilidade perdida e
instabilidade local, com figuras e telas atualizadas.
</commit_message>
<xml_diff>
--- a/docs/Proposta_Projeto_Final.docx
+++ b/docs/Proposta_Projeto_Final.docx
@@ -27,7 +27,7 @@
           <w:sz w:val="28"/>
           <w:szCs w:val="28"/>
         </w:rPr>
-        <w:t xml:space="preserve">Flooding Mapping: interdições por alagamento pluvial e acesso à saúde em Porto Alegre</w:t>
+        <w:t xml:space="preserve">Flooding Mapping: quanto da mobilidade urbana Porto Alegre perde com chuvas de até 45 mm</w:t>
       </w:r>
     </w:p>
     <w:p>
@@ -72,7 +72,7 @@
           <w:sz w:val="21"/>
           <w:szCs w:val="21"/>
         </w:rPr>
-        <w:t xml:space="preserve"> https://github.com/helenavalanera/flooding-mapping-capstone/tree/develop</w:t>
+        <w:t xml:space="preserve"> https://github.com/helenavalanera/flooding-mapping-capstone/tree/entrega</w:t>
       </w:r>
     </w:p>
     <w:p>
@@ -110,30 +110,46 @@
           <w:sz w:val="21"/>
           <w:szCs w:val="21"/>
         </w:rPr>
-        <w:t xml:space="preserve">quantos serviços de saúde deixam de ser alcançáveis em até 30 minutos, a pé, de carro e de ônibus, quando trechos documentados são interditados</w:t>
-      </w:r>
-      <w:r>
-        <w:rPr>
-          <w:sz w:val="21"/>
-          <w:szCs w:val="21"/>
-        </w:rPr>
-        <w:t xml:space="preserve">, quanto essas interdições reduzem a conectividade das redes e </w:t>
-      </w:r>
-      <w:r>
-        <w:rPr>
-          <w:b/>
-          <w:bCs/>
-          <w:sz w:val="21"/>
-          <w:szCs w:val="21"/>
-        </w:rPr>
-        <w:t xml:space="preserve">quais trechos têm terreno semelhante aos já interditados</w:t>
-      </w:r>
-      <w:r>
-        <w:rPr>
-          <w:sz w:val="21"/>
-          <w:szCs w:val="21"/>
-        </w:rPr>
-        <w:t xml:space="preserve">. Esse mapa de propensão, cruzado com a previsão de chuva, alimenta um </w:t>
+        <w:t xml:space="preserve">quanto da mobilidade urbana, a pé, de ônibus e de carro, deixa de ser alcançável com chuvas de até 45 mm em 24 horas</w:t>
+      </w:r>
+      <w:r>
+        <w:rPr>
+          <w:sz w:val="21"/>
+          <w:szCs w:val="21"/>
+        </w:rPr>
+        <w:t xml:space="preserve">, diante das condições precárias de drenagem da cidade, quando trechos documentados são interditados. A ideia é tornar visível que </w:t>
+      </w:r>
+      <w:r>
+        <w:rPr>
+          <w:b/>
+          <w:bCs/>
+          <w:sz w:val="21"/>
+          <w:szCs w:val="21"/>
+        </w:rPr>
+        <w:t xml:space="preserve">a cidade fica propensa ao caos e à instabilidade mesmo com chuvas comuns</w:t>
+      </w:r>
+      <w:r>
+        <w:rPr>
+          <w:sz w:val="21"/>
+          <w:szCs w:val="21"/>
+        </w:rPr>
+        <w:t xml:space="preserve">, prejudicando o deslocamento e o acesso a tudo. Produto final: </w:t>
+      </w:r>
+      <w:r>
+        <w:rPr>
+          <w:b/>
+          <w:bCs/>
+          <w:sz w:val="21"/>
+          <w:szCs w:val="21"/>
+        </w:rPr>
+        <w:t xml:space="preserve">cartografia</w:t>
+      </w:r>
+      <w:r>
+        <w:rPr>
+          <w:sz w:val="21"/>
+          <w:szCs w:val="21"/>
+        </w:rPr>
+        <w:t xml:space="preserve"> da mobilidade perdida por nível de chuva e um </w:t>
       </w:r>
       <w:r>
         <w:rPr>
@@ -149,23 +165,7 @@
           <w:sz w:val="21"/>
           <w:szCs w:val="21"/>
         </w:rPr>
-        <w:t xml:space="preserve"> para o cidadão. Produto final: </w:t>
-      </w:r>
-      <w:r>
-        <w:rPr>
-          <w:b/>
-          <w:bCs/>
-          <w:sz w:val="21"/>
-          <w:szCs w:val="21"/>
-        </w:rPr>
-        <w:t xml:space="preserve">cartografia</w:t>
-      </w:r>
-      <w:r>
-        <w:rPr>
-          <w:sz w:val="21"/>
-          <w:szCs w:val="21"/>
-        </w:rPr>
-        <w:t xml:space="preserve"> de acessibilidade, perda e propensão, com componente de </w:t>
+        <w:t xml:space="preserve"> com componente de </w:t>
       </w:r>
       <w:r>
         <w:rPr>
@@ -212,30 +212,14 @@
           <w:sz w:val="21"/>
           <w:szCs w:val="21"/>
         </w:rPr>
-        <w:t xml:space="preserve">ODS 3 (3.8)</w:t>
-      </w:r>
-      <w:r>
-        <w:rPr>
-          <w:sz w:val="21"/>
-          <w:szCs w:val="21"/>
-        </w:rPr>
-        <w:t xml:space="preserve"> acesso a serviços de saúde; </w:t>
-      </w:r>
-      <w:r>
-        <w:rPr>
-          <w:b/>
-          <w:bCs/>
-          <w:sz w:val="21"/>
-          <w:szCs w:val="21"/>
-        </w:rPr>
-        <w:t xml:space="preserve">ODS 11 (11.2, 11.5)</w:t>
-      </w:r>
-      <w:r>
-        <w:rPr>
-          <w:sz w:val="21"/>
-          <w:szCs w:val="21"/>
-        </w:rPr>
-        <w:t xml:space="preserve"> transporte e redução de impactos de desastres urbanos; </w:t>
+        <w:t xml:space="preserve">ODS 11 (11.2 e 11.5)</w:t>
+      </w:r>
+      <w:r>
+        <w:rPr>
+          <w:sz w:val="21"/>
+          <w:szCs w:val="21"/>
+        </w:rPr>
+        <w:t xml:space="preserve"> transporte acessível e redução dos impactos de desastres nas cidades; </w:t>
       </w:r>
       <w:r>
         <w:rPr>
@@ -267,7 +251,7 @@
           <w:sz w:val="21"/>
           <w:szCs w:val="21"/>
         </w:rPr>
-        <w:t xml:space="preserve"> infraestrutura resiliente. Contribuição prática: indicar onde a perda de acesso à saúde é maior quando pontos recorrentes alagam, apoiando a priorização de drenagem e desvios, e antecipar trechos, linhas de ônibus e serviços expostos em dias de chuva. O pipeline usa só dados geoespaciais abertos (OpenStreetMap, GTFS, IBGE e o modelo digital de elevação Copernicus, derivado de satélite), é reprodutível e replicável; a fase 2 incorpora imagens de radar Sentinel-1.</w:t>
+        <w:t xml:space="preserve"> infraestrutura resiliente. Contribuição prática: mostrar com que frequência e onde a chuva desorganiza a cidade, para priorizar drenagem e desvios, e antecipar trechos e linhas de ônibus expostos. O pipeline usa só dados geoespaciais abertos (OpenStreetMap, GTFS, IBGE e o modelo digital de elevação Copernicus, derivado de satélite), é reprodutível e replicável; a fase 2 incorpora imagens de radar Sentinel-1.</w:t>
       </w:r>
     </w:p>
     <w:p>
@@ -300,7 +284,7 @@
           <w:sz w:val="21"/>
           <w:szCs w:val="21"/>
         </w:rPr>
-        <w:t xml:space="preserve">Coles, D. et al. (2017). Beyond “flood hotspots”: modelling emergency service accessibility during flooding in York, UK. J. Hydrology 546:419–436. doi:10.1016/j.jhydrol.2016.12.013 — acopla alagamento e análise de redes para medir o acesso de serviços de emergência.</w:t>
+        <w:t xml:space="preserve">Coles, D. et al. (2017). Beyond “flood hotspots”: modelling emergency service accessibility during flooding in York, UK. J. Hydrology 546:419–436. doi:10.1016/j.jhydrol.2016.12.013 — acopla alagamento e análise de redes para medir acessibilidade.</w:t>
       </w:r>
     </w:p>
     <w:p>
@@ -317,7 +301,7 @@
           <w:sz w:val="21"/>
           <w:szCs w:val="21"/>
         </w:rPr>
-        <w:t xml:space="preserve">Green, D. et al. (2017). City-scale accessibility of emergency responders operating during flood events. NHESS 17:1–16. doi:10.5194/nhess-17-1-2017 — alagamentos superficiais perturbam o acesso mais que cheias fluviais de magnitude similar.</w:t>
+        <w:t xml:space="preserve">Green, D. et al. (2017). City-scale accessibility of emergency responders operating during flood events. NHESS 17:1–16. doi:10.5194/nhess-17-1-2017 — alagamentos superficiais perturbam o deslocamento mais que cheias fluviais de magnitude similar.</w:t>
       </w:r>
     </w:p>
     <w:p>
@@ -620,7 +604,7 @@
                 <w:sz w:val="18"/>
                 <w:szCs w:val="18"/>
               </w:rPr>
-              <w:t xml:space="preserve">Vias, destinos e drenagem</w:t>
+              <w:t xml:space="preserve">Vias e drenagem</w:t>
             </w:r>
           </w:p>
         </w:tc>
@@ -678,7 +662,7 @@
                 <w:sz w:val="18"/>
                 <w:szCs w:val="18"/>
               </w:rPr>
-              <w:t xml:space="preserve">Recorte municipal +3 km; 176.836 segmentos; 181 serviços de saúde; arroios, valas e bueiros</w:t>
+              <w:t xml:space="preserve">Recorte municipal +3 km; 176.836 segmentos de via; arroios, valas e bueiros</w:t>
             </w:r>
           </w:p>
         </w:tc>
@@ -1005,7 +989,7 @@
                 <w:sz w:val="18"/>
                 <w:szCs w:val="18"/>
               </w:rPr>
-              <w:t xml:space="preserve">Open-Meteo, previsão ao vivo e arquivo histórico (JSON)</w:t>
+              <w:t xml:space="preserve">Open-Meteo: previsão ao vivo, arquivo de previsões e reanálise (JSON)</w:t>
             </w:r>
           </w:p>
         </w:tc>
@@ -1034,7 +1018,7 @@
                 <w:sz w:val="18"/>
                 <w:szCs w:val="18"/>
               </w:rPr>
-              <w:t xml:space="preserve">Chuva nas 24 h antes de cada bloqueio para calibrar os limiares do alerta</w:t>
+              <w:t xml:space="preserve">Chuva antes de cada bloqueio (limiares) e frequência anual 2015–2024</w:t>
             </w:r>
           </w:p>
         </w:tc>
@@ -1072,30 +1056,30 @@
           <w:sz w:val="21"/>
           <w:szCs w:val="21"/>
         </w:rPr>
-        <w:t xml:space="preserve">Acessibilidade (r5py):</w:t>
-      </w:r>
-      <w:r>
-        <w:rPr>
-          <w:sz w:val="21"/>
-          <w:szCs w:val="21"/>
-        </w:rPr>
-        <w:t xml:space="preserve"> destinos alcançáveis em até 30 min por origem e modo (A0); em cada cenário, os segmentos de via que cruzam zonas de 50/100/150 m em torno do bloqueio são removidos e a acessibilidade é recalculada (A_s). Perdas L = A0 − A_s e P = L/A0. </w:t>
-      </w:r>
-      <w:r>
-        <w:rPr>
-          <w:b/>
-          <w:bCs/>
-          <w:sz w:val="21"/>
-          <w:szCs w:val="21"/>
-        </w:rPr>
-        <w:t xml:space="preserve">Robustez</w:t>
-      </w:r>
-      <w:r>
-        <w:rPr>
-          <w:sz w:val="21"/>
-          <w:szCs w:val="21"/>
-        </w:rPr>
-        <w:t xml:space="preserve"> (NetworkX): eficiência global e local e maior componente conexa.</w:t>
+        <w:t xml:space="preserve">Cidade alcançável (r5py):</w:t>
+      </w:r>
+      <w:r>
+        <w:rPr>
+          <w:sz w:val="21"/>
+          <w:szCs w:val="21"/>
+        </w:rPr>
+        <w:t xml:space="preserve"> para cada célula da grade, a população da cidade alcançável em até 30 minutos, a pé, de ônibus e de carro (A0). </w:t>
+      </w:r>
+      <w:r>
+        <w:rPr>
+          <w:b/>
+          <w:bCs/>
+          <w:sz w:val="21"/>
+          <w:szCs w:val="21"/>
+        </w:rPr>
+        <w:t xml:space="preserve">Mobilidade perdida</w:t>
+      </w:r>
+      <w:r>
+        <w:rPr>
+          <w:sz w:val="21"/>
+          <w:szCs w:val="21"/>
+        </w:rPr>
+        <w:t xml:space="preserve"> = redução, ponderada pela população, de todos os deslocamentos possíveis quando a chuva fecha vias (A_s).</w:t>
       </w:r>
     </w:p>
     <w:p>
@@ -1114,14 +1098,14 @@
           <w:sz w:val="21"/>
           <w:szCs w:val="21"/>
         </w:rPr>
-        <w:t xml:space="preserve">ML preditivo, suscetibilidade:</w:t>
-      </w:r>
-      <w:r>
-        <w:rPr>
-          <w:sz w:val="21"/>
-          <w:szCs w:val="21"/>
-        </w:rPr>
-        <w:t xml:space="preserve"> regressão logística regularizada e random forest classificam 107.869 segmentos viários pela semelhança com os locais já interditados (positivos e não rotulados), com variáveis de relevo, escoamento e drenagem; validação espacial em blocos de 2 km e temporal (treino 2019–2022, teste 2025), contra regra simples e sorteio.</w:t>
+        <w:t xml:space="preserve">Da chuva ao bloqueio:</w:t>
+      </w:r>
+      <w:r>
+        <w:rPr>
+          <w:sz w:val="21"/>
+          <w:szCs w:val="21"/>
+        </w:rPr>
+        <w:t xml:space="preserve"> abaixo de 26,2 mm em 24 h (menor acumulado com bloqueio registrado) nada fecha; a partir dele fecham os pontos documentados e mais N pontos apontados pelo modelo, com N vindo do ajuste entre chuva e número de bloqueios por data, e um fator de precariedade para simular drenagem pior.</w:t>
       </w:r>
     </w:p>
     <w:p>
@@ -1140,14 +1124,14 @@
           <w:sz w:val="21"/>
           <w:szCs w:val="21"/>
         </w:rPr>
-        <w:t xml:space="preserve">Dashboard de alerta (determinístico):</w:t>
-      </w:r>
-      <w:r>
-        <w:rPr>
-          <w:sz w:val="21"/>
-          <w:szCs w:val="21"/>
-        </w:rPr>
-        <w:t xml:space="preserve"> com a localização do usuário e a previsão horária de chuva, atribui atenção ou alerta alto aos trechos mais propensos e lista linhas de ônibus e serviços de saúde expostos, explicando como a IA calcula.</w:t>
+        <w:t xml:space="preserve">ML preditivo, suscetibilidade:</w:t>
+      </w:r>
+      <w:r>
+        <w:rPr>
+          <w:sz w:val="21"/>
+          <w:szCs w:val="21"/>
+        </w:rPr>
+        <w:t xml:space="preserve"> regressão logística regularizada e random forest classificam 107.869 segmentos pela semelhança com locais já interditados (positivos e não rotulados), com variáveis de relevo, escoamento e drenagem; validação espacial (blocos de 2 km) e temporal (treino 2019–2022, teste 2025).</w:t>
       </w:r>
     </w:p>
     <w:p>
@@ -1166,30 +1150,30 @@
           <w:sz w:val="21"/>
           <w:szCs w:val="21"/>
         </w:rPr>
-        <w:t xml:space="preserve">ML não supervisionado:</w:t>
-      </w:r>
-      <w:r>
-        <w:rPr>
-          <w:sz w:val="21"/>
-          <w:szCs w:val="21"/>
-        </w:rPr>
-        <w:t xml:space="preserve"> k-means sobre acesso de base e perda máxima, para tipologias de vulnerabilidade. </w:t>
-      </w:r>
-      <w:r>
-        <w:rPr>
-          <w:b/>
-          <w:bCs/>
-          <w:sz w:val="21"/>
-          <w:szCs w:val="21"/>
-        </w:rPr>
-        <w:t xml:space="preserve">Fase 2, deep learning:</w:t>
-      </w:r>
-      <w:r>
-        <w:rPr>
-          <w:sz w:val="21"/>
-          <w:szCs w:val="21"/>
-        </w:rPr>
-        <w:t xml:space="preserve"> segmentação de áreas alagadas em Sentinel-1 (U-Net) para ampliar os rótulos.</w:t>
+        <w:t xml:space="preserve">Dashboard de alerta:</w:t>
+      </w:r>
+      <w:r>
+        <w:rPr>
+          <w:sz w:val="21"/>
+          <w:szCs w:val="21"/>
+        </w:rPr>
+        <w:t xml:space="preserve"> com a localização do usuário e a previsão de chuva, indica trechos em atenção ou alerta alto, linhas expostas e quanto da cidade deixa de ser alcançável, explicando como a IA calcula. </w:t>
+      </w:r>
+      <w:r>
+        <w:rPr>
+          <w:b/>
+          <w:bCs/>
+          <w:sz w:val="21"/>
+          <w:szCs w:val="21"/>
+        </w:rPr>
+        <w:t xml:space="preserve">Também:</w:t>
+      </w:r>
+      <w:r>
+        <w:rPr>
+          <w:sz w:val="21"/>
+          <w:szCs w:val="21"/>
+        </w:rPr>
+        <w:t xml:space="preserve"> robustez das redes (NetworkX), tipologia k-means e, na fase 2, deep learning (U-Net em Sentinel-1) para ampliar os rótulos.</w:t>
       </w:r>
     </w:p>
     <w:p>
@@ -1211,7 +1195,7 @@
           <w:sz w:val="21"/>
           <w:szCs w:val="21"/>
         </w:rPr>
-        <w:t xml:space="preserve"> há poucos eventos e nenhum registro de “chuva sem alagamento”; por isso o modelo supervisionado é tratado como problema de positivos e não rotulados, comparado a regras simples, e o DL só se justifica quando o satélite fornecer rótulos em escala.</w:t>
+        <w:t xml:space="preserve"> há poucos eventos e nenhum registro de “chuva sem alagamento”; por isso o modelo supervisionado é tratado como problema de positivos e não rotulados e comparado a regras simples, e o deep learning só se justifica quando o satélite fornecer rótulos em escala.</w:t>
       </w:r>
     </w:p>
     <w:p>
@@ -1226,46 +1210,94 @@
           <w:sz w:val="21"/>
           <w:szCs w:val="21"/>
         </w:rPr>
-        <w:t xml:space="preserve">Resultados iniciais</w:t>
-      </w:r>
-      <w:r>
-        <w:rPr>
-          <w:sz w:val="21"/>
-          <w:szCs w:val="21"/>
-        </w:rPr>
-        <w:t xml:space="preserve"> (trechos ainda sem validação humana): </w:t>
-      </w:r>
-      <w:r>
-        <w:rPr>
-          <w:b/>
-          <w:bCs/>
-          <w:sz w:val="21"/>
-          <w:szCs w:val="21"/>
-        </w:rPr>
-        <w:t xml:space="preserve">A0</w:t>
-      </w:r>
-      <w:r>
-        <w:rPr>
-          <w:sz w:val="21"/>
-          <w:szCs w:val="21"/>
-        </w:rPr>
-        <w:t xml:space="preserve"> médio de 1,9 destino a pé, 14,0 de ônibus e 100,2 de carro. Uma interdição de 100 m em Dona Teodora × A. J. Renner (bloqueio total em 2024 e 2025) tira 83% do acesso a pé de 2 origens e reduz em 17% a eficiência local da rede de pedestres; os bloqueios simultâneos de 18/06/2025 reduzem o acesso de carro em 153 origens (≈ 374 mil pessoas estimadas). Com as variáveis de drenagem, a regressão logística sobe do percentil 79 para 86 no teste temporal e </w:t>
-      </w:r>
-      <w:r>
-        <w:rPr>
-          <w:b/>
-          <w:bCs/>
-          <w:sz w:val="21"/>
-          <w:szCs w:val="21"/>
-        </w:rPr>
-        <w:t xml:space="preserve">empata</w:t>
-      </w:r>
-      <w:r>
-        <w:rPr>
-          <w:sz w:val="21"/>
-          <w:szCs w:val="21"/>
-        </w:rPr>
-        <w:t xml:space="preserve"> com a regra de terreno baixo (85); o random forest sobreajusta.</w:t>
+        <w:t xml:space="preserve">Resultados iniciais:</w:t>
+      </w:r>
+      <w:r>
+        <w:rPr>
+          <w:sz w:val="21"/>
+          <w:szCs w:val="21"/>
+        </w:rPr>
+        <w:t xml:space="preserve"> chuvas de 26 mm ou mais em 24 h, que já causam bloqueios, ocorrem em média </w:t>
+      </w:r>
+      <w:r>
+        <w:rPr>
+          <w:b/>
+          <w:bCs/>
+          <w:sz w:val="21"/>
+          <w:szCs w:val="21"/>
+        </w:rPr>
+        <w:t xml:space="preserve">14 dias por ano</w:t>
+      </w:r>
+      <w:r>
+        <w:rPr>
+          <w:sz w:val="21"/>
+          <w:szCs w:val="21"/>
+        </w:rPr>
+        <w:t xml:space="preserve">. Sem chuva, cada célula alcança em média 80% da cidade de carro, 14% de ônibus e 2,7% a pé. Com 26–35 mm, a cidade perde </w:t>
+      </w:r>
+      <w:r>
+        <w:rPr>
+          <w:b/>
+          <w:bCs/>
+          <w:sz w:val="21"/>
+          <w:szCs w:val="21"/>
+        </w:rPr>
+        <w:t xml:space="preserve">3,5% da mobilidade de carro</w:t>
+      </w:r>
+      <w:r>
+        <w:rPr>
+          <w:sz w:val="21"/>
+          <w:szCs w:val="21"/>
+        </w:rPr>
+        <w:t xml:space="preserve"> e </w:t>
+      </w:r>
+      <w:r>
+        <w:rPr>
+          <w:b/>
+          <w:bCs/>
+          <w:sz w:val="21"/>
+          <w:szCs w:val="21"/>
+        </w:rPr>
+        <w:t xml:space="preserve">81 mil pessoas</w:t>
+      </w:r>
+      <w:r>
+        <w:rPr>
+          <w:sz w:val="21"/>
+          <w:szCs w:val="21"/>
+        </w:rPr>
+        <w:t xml:space="preserve"> perdem ao menos 10% da cidade alcançável, com perdas locais de até 73%; com 40–45 mm, a perda dobra para </w:t>
+      </w:r>
+      <w:r>
+        <w:rPr>
+          <w:b/>
+          <w:bCs/>
+          <w:sz w:val="21"/>
+          <w:szCs w:val="21"/>
+        </w:rPr>
+        <w:t xml:space="preserve">7,0%</w:t>
+      </w:r>
+      <w:r>
+        <w:rPr>
+          <w:sz w:val="21"/>
+          <w:szCs w:val="21"/>
+        </w:rPr>
+        <w:t xml:space="preserve"> e atinge </w:t>
+      </w:r>
+      <w:r>
+        <w:rPr>
+          <w:b/>
+          <w:bCs/>
+          <w:sz w:val="21"/>
+          <w:szCs w:val="21"/>
+        </w:rPr>
+        <w:t xml:space="preserve">190 mil pessoas</w:t>
+      </w:r>
+      <w:r>
+        <w:rPr>
+          <w:sz w:val="21"/>
+          <w:szCs w:val="21"/>
+        </w:rPr>
+        <w:t xml:space="preserve">, e há áreas que perdem 74% do que alcançam a pé. Na suscetibilidade, as variáveis de drenagem elevam a regressão logística do percentil 79 para 86 no teste temporal, empatando com a regra de terreno baixo.</w:t>
       </w:r>
     </w:p>
     <w:p>
@@ -1287,7 +1319,7 @@
           <w:sz w:val="21"/>
           <w:szCs w:val="21"/>
         </w:rPr>
-        <w:t xml:space="preserve"> destinos do OSM incompletos; GTFS de 2025; bloqueio binário; eventos com viés de notificação; sem dados abertos de bocas de lobo e limpeza urbana; o alerta é nível heurístico, não probabilidade, e cobre só Porto Alegre.</w:t>
+        <w:t xml:space="preserve"> ajuste chuva × bloqueios com 3 datas; GTFS de 2025; bloqueio binário; eventos com viés de notificação; sem dados abertos de bocas de lobo e limpeza urbana; temporais curtos podem fechar vias abaixo do limiar; o alerta é nível heurístico, não probabilidade, e cobre só Porto Alegre.</w:t>
       </w:r>
     </w:p>
     <w:sectPr>

</xml_diff>